<commit_message>
Address review: pot from paid orders, stable event group key, events list fallback, Word manual wording
- Admin song pot totals the paid linked orders instead of multiplying by the
  event's current price, so a later price change cannot misstate the payout
- Song order lines keep the event title as the item name (the admin purchase
  group key); the song goes in the size/detail field, which receipts show
- Public events list retries without registration_mode if the application
  deploys before the migration
- Word manual now states that two different players are needed

Co-Authored-By: Claude Opus 5.5 <noreply@anthropic.com>
Claude-Session: https://claude.ai/code/session_01QCBxRx7gaErugFvcaJAVE2
</commit_message>
<xml_diff>
--- a/public/documents/20260927-Dino-Coach-User-Manual-Rev01.docx
+++ b/public/documents/20260927-Dino-Coach-User-Manual-Rev01.docx
@@ -54,7 +54,7 @@
           </w:p>
           <w:p>
             <w:r>
-              <w:t>All teams must include at least one player from the men’s and women’s sections in the squad. Bench players qualify. Accept rules version 2026-27-rev07 before submitting. Existing selections and purchase costs are retained. Update and submit any non-compliant squad by Friday 2 October 2026 (Melbourne time).</w:t>
+              <w:t>All teams must include at least one player from the men’s and women’s sections in the squad. Two different players are needed; a player recorded in both sections counts for only one of them. Bench players qualify. Accept rules version 2026-27-rev07 before submitting. Existing selections and purchase costs are retained. Update and submit any non-compliant squad by Friday 2 October 2026 (Melbourne time).</w:t>
             </w:r>
           </w:p>
         </w:tc>
@@ -193,7 +193,7 @@
           </w:tcPr>
           <w:p>
             <w:r>
-              <w:t>All teams must include at least one player from the men’s and women’s sections in the squad. Bench players qualify.</w:t>
+              <w:t>All teams must include at least one player from the men’s and women’s sections in the squad. Two different players are needed; a player recorded in both sections counts for only one of them. Bench players qualify.</w:t>
             </w:r>
           </w:p>
         </w:tc>
@@ -734,7 +734,7 @@
     </w:p>
     <w:p>
       <w:r>
-        <w:t>All teams must include at least one player from the men’s and women’s sections in the squad. Use the catalogue labels and check both section counts in My squad. Bench players qualify; no starting-XI section minimum applies. You may save an incomplete draft. Update and submit any non-compliant squad by Friday 2 October 2026 (Melbourne time).</w:t>
+        <w:t>All teams must include at least one player from the men’s and women’s sections in the squad. Two different players are needed; a player recorded in both sections counts for only one of them. Use the catalogue labels and check both section counts in My squad. Bench players qualify; no starting-XI section minimum applies. You may save an incomplete draft. Update and submit any non-compliant squad by Friday 2 October 2026 (Melbourne time).</w:t>
       </w:r>
     </w:p>
     <w:p>
@@ -1845,7 +1845,7 @@
     </w:p>
     <w:p>
       <w:r>
-        <w:t>A replacement in a submitted squad must retain at least one player from each of the men’s and women’s sections. Bench players qualify. Use My squad to make several changes together. Existing and carried-forward squads must meet this minimum before scores can be published.</w:t>
+        <w:t>A replacement in a submitted squad must retain at least one player from each of the men’s and women’s sections, held by two different players. Bench players qualify. Use My squad to make several changes together. Existing and carried-forward squads must meet this minimum before scores can be published.</w:t>
       </w:r>
     </w:p>
     <w:p>
@@ -2367,7 +2367,7 @@
           </w:tcPr>
           <w:p>
             <w:r>
-              <w:t>Check both section counts in My squad. Include at least one club-confirmed player from each of the men’s and women’s sections across your 15 slots. Bench players qualify. If a classification needs correction, contact the club through the feedback form.</w:t>
+              <w:t>Check both section counts in My squad. Include at least one club-confirmed player from each of the men’s and women’s sections across your 15 slots, using two different players. Bench players qualify. If a classification needs correction, contact the club through the feedback form.</w:t>
             </w:r>
           </w:p>
         </w:tc>

</xml_diff>